<commit_message>
Reconcile Methods with recovered HPC command evidence
</commit_message>
<xml_diff>
--- a/Publication/methods/MATERIALS_AND_METHODS_RESEARCHER_DRAFT.docx
+++ b/Publication/methods/MATERIALS_AND_METHODS_RESEARCHER_DRAFT.docx
@@ -209,7 +209,7 @@
           <w:color w:val="000000"/>
           <w:sz w:val="22"/>
         </w:rPr>
-        <w:t>To remove mitochondrial reads, we indexed a mitochondrial reference (GenBank AY728227.1) and aligned paired reads with BWA-MEM using eight threads. After converting and sorting the alignments with SAMtools, samtools view -f 12 -F 256 retained pairs in which neither mate mapped to the mitochondrial reference. These pairs were the nuclear-read input for subsequent TE analyses.</w:t>
+        <w:t>The preprocessing notebook records paired-end fastp with --detect_adapter_for_pe and -t 32. The latter specifies 32-base tail trimming rather than 32 threads. The installed fastp version and commands applied to individual runs were not retained.</w:t>
       </w:r>
     </w:p>
     <w:p>
@@ -224,7 +224,42 @@
           <w:color w:val="000000"/>
           <w:sz w:val="22"/>
         </w:rPr>
-        <w:t xml:space="preserve">A </w:t>
+        <w:t xml:space="preserve">To remove mitochondrial reads, we indexed the </w:t>
+      </w:r>
+      <w:r>
+        <w:rPr>
+          <w:rFonts w:ascii="Times New Roman" w:hAnsi="Times New Roman" w:eastAsia="Times New Roman"/>
+          <w:b w:val="0"/>
+          <w:i/>
+          <w:color w:val="000000"/>
+          <w:sz w:val="22"/>
+        </w:rPr>
+        <w:t>D. fuscus</w:t>
+      </w:r>
+      <w:r>
+        <w:rPr>
+          <w:rFonts w:ascii="Times New Roman" w:hAnsi="Times New Roman" w:eastAsia="Times New Roman"/>
+          <w:b w:val="0"/>
+          <w:i w:val="0"/>
+          <w:color w:val="000000"/>
+          <w:sz w:val="22"/>
+        </w:rPr>
+        <w:t xml:space="preserve"> mitochondrial reference (GenBank AY728227.1; the identical RefSeq sequence is NC_006339.1) and aligned paired reads with BWA-MEM using eight threads. After converting and sorting the alignments with SAMtools, samtools view -f 12 -F 256 retained pairs in which neither mate mapped to the mitochondrial reference. Historical job files preserve these commands but accept the reference and read files as arguments, without recording their identities for each run. The notebook includes name sorting and paired FASTQ export with samtools fastq; the exact conversion from nuclear BAM files to the mate-specific dnaPipeTE inputs remains undocumented.</w:t>
+      </w:r>
+    </w:p>
+    <w:p>
+      <w:pPr>
+        <w:widowControl/>
+      </w:pPr>
+      <w:r>
+        <w:rPr>
+          <w:rFonts w:ascii="Times New Roman" w:hAnsi="Times New Roman" w:eastAsia="Times New Roman"/>
+          <w:b w:val="0"/>
+          <w:i w:val="0"/>
+          <w:color w:val="000000"/>
+          <w:sz w:val="22"/>
+        </w:rPr>
+        <w:t xml:space="preserve">A custom repeat library was generated for the </w:t>
       </w:r>
       <w:r>
         <w:rPr>
@@ -244,7 +279,97 @@
           <w:color w:val="000000"/>
           <w:sz w:val="22"/>
         </w:rPr>
-        <w:t>-specific repeat library was generated with RepeatModeler in the TEtools 1.87.sif container under Singularity 3.7.4. A database was built for each assembly, and RepeatModeler ran with 32 threads, -LTRStruct, and -genomeSampleSizeMax 10000000000. Redundant consensus sequences were clustered with CD-HIT-EST using -d 0 -aS 0.8 -c 0.8 -G 0 -g 1 -b 500 -T 64 -M 500000. The custom library was then used as the TE database for dnaPipeTE.</w:t>
+        <w:t xml:space="preserve"> analyses. The construction notebook describes RepeatModeler runs on </w:t>
+      </w:r>
+      <w:r>
+        <w:rPr>
+          <w:rFonts w:ascii="Times New Roman" w:hAnsi="Times New Roman" w:eastAsia="Times New Roman"/>
+          <w:b w:val="0"/>
+          <w:i/>
+          <w:color w:val="000000"/>
+          <w:sz w:val="22"/>
+        </w:rPr>
+        <w:t>Desmognathus</w:t>
+      </w:r>
+      <w:r>
+        <w:rPr>
+          <w:rFonts w:ascii="Times New Roman" w:hAnsi="Times New Roman" w:eastAsia="Times New Roman"/>
+          <w:b w:val="0"/>
+          <w:i w:val="0"/>
+          <w:color w:val="000000"/>
+          <w:sz w:val="22"/>
+        </w:rPr>
+        <w:t xml:space="preserve"> assemblies, </w:t>
+      </w:r>
+      <w:r>
+        <w:rPr>
+          <w:rFonts w:ascii="Times New Roman" w:hAnsi="Times New Roman" w:eastAsia="Times New Roman"/>
+          <w:b w:val="0"/>
+          <w:i/>
+          <w:color w:val="000000"/>
+          <w:sz w:val="22"/>
+        </w:rPr>
+        <w:t>Ambystoma</w:t>
+      </w:r>
+      <w:r>
+        <w:rPr>
+          <w:rFonts w:ascii="Times New Roman" w:hAnsi="Times New Roman" w:eastAsia="Times New Roman"/>
+          <w:b w:val="0"/>
+          <w:i w:val="0"/>
+          <w:color w:val="000000"/>
+          <w:sz w:val="22"/>
+        </w:rPr>
+        <w:t xml:space="preserve"> chromosome sequences, and a split </w:t>
+      </w:r>
+      <w:r>
+        <w:rPr>
+          <w:rFonts w:ascii="Times New Roman" w:hAnsi="Times New Roman" w:eastAsia="Times New Roman"/>
+          <w:b w:val="0"/>
+          <w:i/>
+          <w:color w:val="000000"/>
+          <w:sz w:val="22"/>
+        </w:rPr>
+        <w:t>D. fuscus</w:t>
+      </w:r>
+      <w:r>
+        <w:rPr>
+          <w:rFonts w:ascii="Times New Roman" w:hAnsi="Times New Roman" w:eastAsia="Times New Roman"/>
+          <w:b w:val="0"/>
+          <w:i w:val="0"/>
+          <w:color w:val="000000"/>
+          <w:sz w:val="22"/>
+        </w:rPr>
+        <w:t xml:space="preserve"> assembly. The recovered job loads a Singularity 3.7.4 module and invokes tetools_1.87.sif, BuildDatabase for each assembly, and RepeatModeler with 32 threads, -LTRStruct, and -genomeSampleSizeMax 10000000000. The container filename does not establish the RepeatModeler version or image contents.</w:t>
+      </w:r>
+    </w:p>
+    <w:p>
+      <w:pPr>
+        <w:widowControl/>
+      </w:pPr>
+      <w:r>
+        <w:rPr>
+          <w:rFonts w:ascii="Times New Roman" w:hAnsi="Times New Roman" w:eastAsia="Times New Roman"/>
+          <w:b w:val="0"/>
+          <w:i w:val="0"/>
+          <w:color w:val="000000"/>
+          <w:sz w:val="22"/>
+        </w:rPr>
+        <w:t>Historical curation notes record DeepTE with the Metazoan model and TEsorter with the rexdb-metazoa database and -p 64. They also label a classifier as TEClass2 while recording the executable TEClass/TEclass-2.1.3d/TEclassTest.pl. This record does not identify which TEClass implementation was used or how the classifier outputs contributed to the final library.</w:t>
+      </w:r>
+    </w:p>
+    <w:p>
+      <w:pPr>
+        <w:widowControl/>
+      </w:pPr>
+      <w:r>
+        <w:rPr>
+          <w:rFonts w:ascii="Times New Roman" w:hAnsi="Times New Roman" w:eastAsia="Times New Roman"/>
+          <w:b w:val="0"/>
+          <w:i w:val="0"/>
+          <w:color w:val="000000"/>
+          <w:sz w:val="22"/>
+        </w:rPr>
+        <w:t>The notes describe extraction of Amphibia families from Dfam 3.8, an initial CD-HIT-EST clustering step, concatenation with the amphibian repeats, and a second clustering step. The recovered CD-HIT-EST job uses -d 0 -aS 0.8 -c 0.8 -G 0 -g 1 -b 500 -T 64 -M 500000 on the merged master library. The final custom library was supplied to dnaPipeTE as dedupe_telib.fasta. Its sequence contents and the link between that file and the recorded classifier, concatenation, and clustering steps remain unresolved.</w:t>
       </w:r>
     </w:p>
     <w:p>
@@ -276,7 +401,7 @@
           <w:color w:val="000000"/>
           <w:sz w:val="22"/>
         </w:rPr>
-        <w:t>TE abundance was estimated with dnaPipeTE from mate 1 of the nuclear-filtered short reads. The analysis used Singularity 4.1.2, 16 CPUs, a configured 15-Gb genome-size denominator, 0.1× target coverage, RM_t = 0.15, two internal samples, and the custom TE library. The 15-Gb value controlled read sampling; it was not a measured genome size or an estimate of absolute TE load.</w:t>
+        <w:t>TE abundance was estimated with dnaPipeTE from mate 1 of the nuclear-filtered short reads. The recovered job specifies Singularity 4.1.2, 16 CPUs, a configured 15-Gb genome-size denominator, 0.1× target coverage, RM_t = 0.15, two internal samples, and the custom TE library. The 15-Gb value controlled read sampling; it was not a measured genome size or an estimate of absolute TE load.</w:t>
       </w:r>
     </w:p>
     <w:p>
@@ -582,7 +707,22 @@
           <w:color w:val="000000"/>
           <w:sz w:val="22"/>
         </w:rPr>
-        <w:t>Repeat divergence profiles were reconstructed from RepeatMasker .align files for the dnaPipeTE Trinity repeat-contig assemblies. The inclusive length of each aligned hit was calculated as |query end - query start| + 1. We removed rows with invalid divergence or length values and grouped reported divergence into one-percentage-point bins with a terminal 50% bin. For each species, aligned bases in each TE category and divergence bin were divided by that species' total inclusive aligned RepeatMasker hit bases. Missing combinations of species, category, and bin were assigned zero before averaging across the 34 species with equal weight.</w:t>
+        <w:t>Repeat divergence profiles were reconstructed from RepeatMasker .align files for the dnaPipeTE Trinity repeat-contig assemblies. Separate historical RepeatMasker jobs specify sensitive search (-s), the custom repeat library, and either -pa 4 or -pa 32. The retained records do not establish which variant produced these annotations, whether they came from standalone jobs or dnaPipeTE's internal RepeatMasker step, or the applied RepeatMasker version and search engine.</w:t>
+      </w:r>
+    </w:p>
+    <w:p>
+      <w:pPr>
+        <w:widowControl/>
+      </w:pPr>
+      <w:r>
+        <w:rPr>
+          <w:rFonts w:ascii="Times New Roman" w:hAnsi="Times New Roman" w:eastAsia="Times New Roman"/>
+          <w:b w:val="0"/>
+          <w:i w:val="0"/>
+          <w:color w:val="000000"/>
+          <w:sz w:val="22"/>
+        </w:rPr>
+        <w:t>The inclusive length of each aligned hit was calculated as |query end - query start| + 1. We removed rows with invalid divergence or length values and grouped reported divergence into one-percentage-point bins with a terminal 50% bin. For each species, aligned bases in each TE category and divergence bin were divided by that species' total inclusive aligned RepeatMasker hit bases. Missing combinations of species, category, and bin were assigned zero before averaging across the 34 species with equal weight.</w:t>
       </w:r>
     </w:p>
     <w:p>
@@ -694,7 +834,7 @@
           <w:color w:val="000000"/>
           <w:sz w:val="22"/>
         </w:rPr>
-        <w:t>DANTE, LTRharvest, and LTRdigest identified candidate full-length long terminal repeat (LTR) elements and annotated the 5' LTR, internal region, and 3' LTR. Candidate sequences were matched to TEsorter annotations by exact sequence identifier and coordinates. Eligible elements were at least 3,000 bp long, were classified by TEsorter as Order = LTR and Superfamily = Gypsy, and had at least five whitespace-delimited DOMAIN|MODEL annotations. These criteria identified 408 eligible LTR/Gypsy elements across 30 species.</w:t>
+        <w:t>DANTE, LTRharvest, and LTRdigest identified candidate full-length long terminal repeat (LTR) elements and annotated the 5' LTR, internal region, and 3' LTR. The recovered discovery script specifies DANTE's Metazoa_v3.1 database and GenomeTools suffix indexing before LTRharvest and LTRdigest; executed tool versions remain unresolved. Candidate sequences were matched to TEsorter annotations by exact sequence identifier and coordinates. Eligible elements were at least 3,000 bp long, were classified by TEsorter as Order = LTR and Superfamily = Gypsy, and had at least five whitespace-delimited DOMAIN|MODEL annotations. These criteria identified 408 eligible LTR/Gypsy elements across 30 species.</w:t>
       </w:r>
     </w:p>
     <w:p>
@@ -709,7 +849,22 @@
           <w:color w:val="000000"/>
           <w:sz w:val="22"/>
         </w:rPr>
-        <w:t>Trimmed, mitochondrial-filtered paired reads from each species were mapped to its LTR contigs with Bowtie2 using -L 20 --very-sensitive-local. SAMtools converted, sorted, and indexed the alignments and calculated depth at each position. Positions absent from the depth output were assigned zero. Mean terminal depth was the length-weighted mean across the 5' and 3' LTRs; mean internal depth covered the annotated internal region. Dividing mean terminal depth by mean internal depth gave the terminal-to-internal ratio. Archived records do not preserve the Bowtie2 and SAMtools versions or the policies for mapping quality, multimappers, secondary or supplementary alignments, and duplicate reads.</w:t>
+        <w:t>Terminal-to-internal ratios were calculated from retained per-element depth files. The archived per-LTR workflow documents Bowtie2 -L 20 --very-sensitive-local on trimmed, mitochondrial-filtered paired reads, followed by SAMtools conversion, sorting, indexing, and per-position depth. The applied commands and correspondence between read inputs and depth files remain incomplete. Bowtie2 and SAMtools versions and policies for mapping quality, multimappers, secondary or supplementary alignments, and duplicate reads remain unresolved.</w:t>
+      </w:r>
+    </w:p>
+    <w:p>
+      <w:pPr>
+        <w:widowControl/>
+      </w:pPr>
+      <w:r>
+        <w:rPr>
+          <w:rFonts w:ascii="Times New Roman" w:hAnsi="Times New Roman" w:eastAsia="Times New Roman"/>
+          <w:b w:val="0"/>
+          <w:i w:val="0"/>
+          <w:color w:val="000000"/>
+          <w:sz w:val="22"/>
+        </w:rPr>
+        <w:t>Positions absent from the retained depth output were assigned zero. Mean terminal depth was the length-weighted mean across the 5' and 3' LTRs; mean internal depth covered the annotated internal region. Dividing mean terminal depth by mean internal depth gave the terminal-to-internal ratio.</w:t>
       </w:r>
     </w:p>
     <w:p>
@@ -1659,7 +1814,7 @@
           <w:color w:val="000000"/>
           <w:sz w:val="22"/>
         </w:rPr>
-        <w:t>Downstream analyses used preserved RepeatModeler, dnaPipeTE, RepeatMasker, LTR mapping, and reviewed microscopy outputs. Processing included matching species identities, averaging technical runs, filtering, calculating diversity and CLR-PCA, fitting phylogenetic models, and generating figures. Phylogenetic analyses used R 4.4.3, ape 5.8.1, phylolm 2.6.5, and phylopath 1.3.1. Released LTR and reviewed-morphology tables include eligibility, exclusion, and quality-control fields for each row. Other raw and high-performance-computing outputs remain in frozen archival storage. Source paths, dimensions, column definitions, and SHA-256 checksums accompany the released files.</w:t>
+        <w:t>Downstream analyses used preserved RepeatModeler, dnaPipeTE, RepeatMasker, LTR mapping, and reviewed microscopy outputs. Processing included matching species identities, averaging technical runs, filtering, calculating diversity and CLR-PCA, fitting phylogenetic models, and generating figures. Phylogenetic analyses used R 4.4.3, ape 5.8.1, phylolm 2.6.5, and phylopath 1.3.1. Released LTR and reviewed-morphology tables include eligibility, exclusion, and quality-control fields for each row. Other raw and high-performance-computing outputs remain in frozen archival storage. Source paths, dimensions, column definitions, and SHA-256 checksums accompany the released files. Recovered upstream commands, source revisions, and checksums accompany the code. These records document configured workflows; complete runtime versions, container digests, custom-library contents, and per-run execution records remain unavailable in the current release.</w:t>
       </w:r>
     </w:p>
     <w:sectPr>

</xml_diff>

<commit_message>
Add reproducible Methods provenance and standard-slide audits
</commit_message>
<xml_diff>
--- a/Publication/methods/MATERIALS_AND_METHODS_RESEARCHER_DRAFT.docx
+++ b/Publication/methods/MATERIALS_AND_METHODS_RESEARCHER_DRAFT.docx
@@ -941,7 +941,7 @@
           <w:color w:val="000000"/>
           <w:sz w:val="22"/>
         </w:rPr>
-        <w:t xml:space="preserve">Each microscopy specimen identifier denoted one animal. Multiple images and measured objects from that animal were repeated observations, not independent biological replicates. For specimens sampled directly, erythrocytes were collected with a pipette from an incision through the heart and deposited at the center of a microscope slide. Slides were stained with Feulgen-Schiff reagent following Hardie et al. (2002). All retained unknown slides and the two designated </w:t>
+        <w:t xml:space="preserve">We checked recorded animal identifiers against specimen records from the Museum of Vertebrate Zoology and collection lists supplied by Alex Pyron. Original and suggested species names were retained separately. Each microscopy specimen identifier denoted one animal. Multiple images and measured objects from that animal were repeated observations, not independent biological replicates. For specimens sampled directly, erythrocytes were collected with a pipette from an incision through the heart and deposited at the center of a microscope slide. Slides were stained with Feulgen-Schiff reagent following Hardie et al. (2002). All retained unknown slides and the two designated </w:t>
       </w:r>
       <w:r>
         <w:rPr>
@@ -1200,7 +1200,7 @@
           <w:color w:val="000000"/>
           <w:sz w:val="22"/>
         </w:rPr>
-        <w:t xml:space="preserve"> species estimate from four reviewed target images, not the two designated standard images. Although the standards and unknowns shared one staining run, the standard nuclei had not completed the same eligibility, image-quality matching, and acceptance process as the target nuclei. The approximately 41% difference between the two standard-slide median IOD values also remained unexplained, so those measurements did not establish a validated calibration denominator. For each conditional genome-size interval, target bootstrap draws were divided by the corresponding </w:t>
+        <w:t xml:space="preserve"> species estimate from four reviewed target images, not the two designated standard images. We assessed the designated standards using the existing masks, retained technical matching features, and frozen 40-nucleus target template. Candidate identities were retained for review, with technical eligibility and manual acceptance recorded separately. Although the standards and unknowns shared one staining run, neither standard-slide candidate pool met the target image-quality balance thresholds, and manual acceptance remained incomplete. The approximately 41% difference between the two standard-slide median IOD values also remained unexplained, so those measurements did not establish a validated calibration denominator. For each conditional genome-size interval, target bootstrap draws were divided by the corresponding </w:t>
       </w:r>
       <w:r>
         <w:rPr>

</xml_diff>